<commit_message>
docs: split the defense script into one guide per presenter
Adds a standalone script for each member so nobody holds pages that
are not theirs. Each carries only that person's slides, the exact cue
line they listen for from the previous speaker, their own lines, the
handoff they give, a note on what happens while they are seated, and
the Q&A questions assigned to them.

Alber takes slides 1, 3, 4, 5, 11, 12, 14 and 15 with ten Q&A
questions; Mardy takes 6, 7, 8 and 10 with the technical questions;
Julebeth takes 2, 9 and 13 with sampling and the waiting-time claim.

Also fixes a gap in the master script: Alber had no handoff line at
the end of slide 12, leaving Julebeth without a cue into slide 13.

Verified: all fifteen slides covered exactly once, and all eight
handoff lines match a cue in the receiving member's script.

Co-Authored-By: Claude Opus 5 <noreply@anthropic.com>
Claude-Session: https://claude.ai/code/session_01WBzHDfCVSZuQGQ8h4bEKjf
</commit_message>
<xml_diff>
--- a/docs/defense/TrikRide_Defense_Script.docx
+++ b/docs/defense/TrikRide_Defense_Script.docx
@@ -1642,6 +1642,14 @@
       </w:r>
       <w:r>
         <w:t xml:space="preserve">, so we do not claim the populations differ. But it points at type size, contrast and plainer wording — and that is an inexpensive fix.</w:t>
+      </w:r>
+    </w:p>
+    <w:p>
+      <w:pPr>
+        <w:pStyle w:val="BodyText"/>
+      </w:pPr>
+      <w:r>
+        <w:t xml:space="preserve">Julebeth will cover who this matters to.</w:t>
       </w:r>
     </w:p>
     <w:bookmarkEnd w:id="31"/>

</xml_diff>